<commit_message>
Update REPORT FOR REVIEW 1 TEMPLATE.docx
</commit_message>
<xml_diff>
--- a/team/REPORT FOR REVIEW 1 TEMPLATE.docx
+++ b/team/REPORT FOR REVIEW 1 TEMPLATE.docx
@@ -166,6 +166,15 @@
     </w:p>
     <w:p>
       <w:pPr>
+        <w:ind w:firstLine="720"/>
+        <w:jc w:val="center"/>
+        <w:rPr>
+          <w:sz w:val="32"/>
+        </w:rPr>
+      </w:pPr>
+    </w:p>
+    <w:p>
+      <w:pPr>
         <w:spacing w:before="1"/>
         <w:ind w:left="2880" w:right="2676"/>
         <w:jc w:val="center"/>
@@ -211,7 +220,6 @@
         <w:pStyle w:val="BodyText"/>
         <w:spacing w:before="385"/>
         <w:ind w:left="0" w:firstLine="0"/>
-        <w:jc w:val="center"/>
         <w:rPr>
           <w:sz w:val="36"/>
         </w:rPr>
@@ -327,26 +335,44 @@
     <w:p>
       <w:pPr>
         <w:pStyle w:val="BodyText"/>
-        <w:spacing w:before="49"/>
         <w:ind w:left="0" w:firstLine="0"/>
         <w:jc w:val="center"/>
         <w:rPr>
           <w:sz w:val="20"/>
         </w:rPr>
       </w:pPr>
+    </w:p>
+    <w:p>
+      <w:pPr>
+        <w:pStyle w:val="BodyText"/>
+        <w:ind w:left="0" w:firstLine="0"/>
+        <w:rPr>
+          <w:sz w:val="20"/>
+        </w:rPr>
+      </w:pPr>
+    </w:p>
+    <w:p>
+      <w:pPr>
+        <w:pStyle w:val="BodyText"/>
+        <w:ind w:left="0" w:firstLine="0"/>
+        <w:jc w:val="center"/>
+        <w:rPr>
+          <w:sz w:val="20"/>
+        </w:rPr>
+      </w:pPr>
       <w:r>
         <w:rPr>
           <w:noProof/>
           <w:sz w:val="20"/>
         </w:rPr>
         <w:drawing>
-          <wp:anchor distT="0" distB="0" distL="0" distR="0" simplePos="0" relativeHeight="487587840" behindDoc="1" locked="0" layoutInCell="1" allowOverlap="1" wp14:anchorId="3A144B21" wp14:editId="37930895">
+          <wp:anchor distT="0" distB="0" distL="0" distR="0" simplePos="0" relativeHeight="487587840" behindDoc="1" locked="0" layoutInCell="1" allowOverlap="1" wp14:anchorId="3A144B21" wp14:editId="7D8767CB">
             <wp:simplePos x="0" y="0"/>
             <wp:positionH relativeFrom="page">
               <wp:posOffset>3185160</wp:posOffset>
             </wp:positionH>
             <wp:positionV relativeFrom="paragraph">
-              <wp:posOffset>192942</wp:posOffset>
+              <wp:posOffset>192405</wp:posOffset>
             </wp:positionV>
             <wp:extent cx="1188996" cy="655320"/>
             <wp:effectExtent l="0" t="0" r="0" b="0"/>
@@ -363,7 +389,7 @@
                     <pic:cNvPicPr/>
                   </pic:nvPicPr>
                   <pic:blipFill>
-                    <a:blip r:embed="rId6" cstate="print"/>
+                    <a:blip r:embed="rId8" cstate="print"/>
                     <a:stretch>
                       <a:fillRect/>
                     </a:stretch>
@@ -386,9 +412,26 @@
     </w:p>
     <w:p>
       <w:pPr>
-        <w:spacing w:before="407"/>
+        <w:pStyle w:val="BodyText"/>
+        <w:spacing w:before="49"/>
+        <w:ind w:left="0" w:firstLine="0"/>
+        <w:jc w:val="center"/>
+        <w:rPr>
+          <w:sz w:val="20"/>
+        </w:rPr>
+      </w:pPr>
+    </w:p>
+    <w:p>
+      <w:pPr>
+        <w:ind w:right="791"/>
+        <w:rPr>
+          <w:sz w:val="36"/>
+        </w:rPr>
+      </w:pPr>
+    </w:p>
+    <w:p>
+      <w:pPr>
         <w:ind w:left="929" w:right="791" w:hanging="48"/>
-        <w:jc w:val="center"/>
         <w:rPr>
           <w:sz w:val="36"/>
         </w:rPr>
@@ -397,7 +440,21 @@
         <w:rPr>
           <w:sz w:val="36"/>
         </w:rPr>
-        <w:t>Department of Computer Science and Engineering Sri</w:t>
+        <w:t>Department of Computer Science and Engineering</w:t>
+      </w:r>
+    </w:p>
+    <w:p>
+      <w:pPr>
+        <w:ind w:left="929" w:right="791" w:hanging="48"/>
+        <w:rPr>
+          <w:sz w:val="36"/>
+        </w:rPr>
+      </w:pPr>
+      <w:r>
+        <w:rPr>
+          <w:sz w:val="36"/>
+        </w:rPr>
+        <w:t>Sri</w:t>
       </w:r>
       <w:r>
         <w:rPr>
@@ -471,7 +528,7 @@
     <w:p>
       <w:pPr>
         <w:pStyle w:val="BodyText"/>
-        <w:spacing w:before="10" w:line="320" w:lineRule="exact"/>
+        <w:spacing w:line="320" w:lineRule="exact"/>
         <w:ind w:left="769" w:firstLine="0"/>
         <w:jc w:val="center"/>
       </w:pPr>
@@ -540,7 +597,6 @@
       <w:pPr>
         <w:spacing w:line="412" w:lineRule="exact"/>
         <w:ind w:left="2911" w:right="2911"/>
-        <w:jc w:val="center"/>
         <w:rPr>
           <w:sz w:val="36"/>
         </w:rPr>
@@ -584,7 +640,7 @@
     <w:p>
       <w:pPr>
         <w:spacing w:line="413" w:lineRule="exact"/>
-        <w:ind w:left="3690"/>
+        <w:ind w:left="2880" w:firstLine="720"/>
         <w:rPr>
           <w:sz w:val="36"/>
         </w:rPr>
@@ -635,19 +691,7 @@
     </w:p>
     <w:p>
       <w:pPr>
-        <w:pStyle w:val="BodyText"/>
-        <w:spacing w:before="122"/>
-        <w:ind w:left="0" w:firstLine="0"/>
-        <w:jc w:val="center"/>
-        <w:rPr>
-          <w:sz w:val="36"/>
-        </w:rPr>
-      </w:pPr>
-    </w:p>
-    <w:p>
-      <w:pPr>
-        <w:ind w:left="445"/>
-        <w:jc w:val="center"/>
+        <w:ind w:left="2880" w:firstLine="720"/>
         <w:rPr>
           <w:b/>
           <w:sz w:val="26"/>
@@ -686,15 +730,6 @@
     </w:p>
     <w:p>
       <w:pPr>
-        <w:pStyle w:val="BodyText"/>
-        <w:spacing w:before="4"/>
-        <w:ind w:left="0" w:firstLine="0"/>
-      </w:pPr>
-      <w:bookmarkStart w:id="0" w:name="For_Documentation"/>
-      <w:bookmarkEnd w:id="0"/>
-    </w:p>
-    <w:p>
-      <w:pPr>
         <w:pStyle w:val="ListParagraph"/>
         <w:numPr>
           <w:ilvl w:val="0"/>
@@ -713,7 +748,9 @@
           <w:szCs w:val="28"/>
         </w:rPr>
       </w:pPr>
+      <w:bookmarkStart w:id="0" w:name="For_Documentation"/>
       <w:bookmarkStart w:id="1" w:name="Table_of_Contents"/>
+      <w:bookmarkEnd w:id="0"/>
       <w:bookmarkEnd w:id="1"/>
       <w:r>
         <w:rPr>
@@ -723,6 +760,7 @@
           <w:sz w:val="28"/>
           <w:szCs w:val="28"/>
         </w:rPr>
+        <w:lastRenderedPageBreak/>
         <w:t>Abstract</w:t>
       </w:r>
     </w:p>
@@ -1556,7 +1594,6 @@
         <w:rPr>
           <w:lang w:val="en-IN"/>
         </w:rPr>
-        <w:lastRenderedPageBreak/>
         <w:t>Controlled runway usage</w:t>
       </w:r>
     </w:p>
@@ -1582,6 +1619,7 @@
         <w:rPr>
           <w:lang w:val="en-IN"/>
         </w:rPr>
+        <w:lastRenderedPageBreak/>
         <w:t>Validated baggage and check-in processes</w:t>
       </w:r>
     </w:p>
@@ -3125,6 +3163,7 @@
           <w:szCs w:val="28"/>
         </w:rPr>
         <w:sectPr>
+          <w:headerReference w:type="default" r:id="rId9"/>
           <w:pgSz w:w="11910" w:h="16840"/>
           <w:pgMar w:top="1340" w:right="1275" w:bottom="280" w:left="1275" w:header="720" w:footer="720" w:gutter="0"/>
           <w:cols w:space="720"/>
@@ -4704,21 +4743,21 @@
     </w:p>
     <w:tbl>
       <w:tblPr>
-        <w:tblW w:w="9004" w:type="dxa"/>
+        <w:tblW w:w="9891" w:type="dxa"/>
         <w:tblInd w:w="-383" w:type="dxa"/>
         <w:tblLook w:val="04A0" w:firstRow="1" w:lastRow="0" w:firstColumn="1" w:lastColumn="0" w:noHBand="0" w:noVBand="1"/>
       </w:tblPr>
       <w:tblGrid>
-        <w:gridCol w:w="1975"/>
-        <w:gridCol w:w="7029"/>
+        <w:gridCol w:w="2169"/>
+        <w:gridCol w:w="7722"/>
       </w:tblGrid>
       <w:tr>
         <w:trPr>
-          <w:trHeight w:val="357"/>
+          <w:trHeight w:val="379"/>
         </w:trPr>
         <w:tc>
           <w:tcPr>
-            <w:tcW w:w="1975" w:type="dxa"/>
+            <w:tcW w:w="2169" w:type="dxa"/>
             <w:tcBorders>
               <w:top w:val="single" w:sz="4" w:space="0" w:color="auto"/>
               <w:left w:val="single" w:sz="4" w:space="0" w:color="auto"/>
@@ -4758,7 +4797,7 @@
         </w:tc>
         <w:tc>
           <w:tcPr>
-            <w:tcW w:w="7029" w:type="dxa"/>
+            <w:tcW w:w="7722" w:type="dxa"/>
             <w:tcBorders>
               <w:top w:val="single" w:sz="4" w:space="0" w:color="auto"/>
               <w:left w:val="nil"/>
@@ -4799,11 +4838,11 @@
       </w:tr>
       <w:tr>
         <w:trPr>
-          <w:trHeight w:val="367"/>
+          <w:trHeight w:val="390"/>
         </w:trPr>
         <w:tc>
           <w:tcPr>
-            <w:tcW w:w="1975" w:type="dxa"/>
+            <w:tcW w:w="2169" w:type="dxa"/>
             <w:tcBorders>
               <w:top w:val="single" w:sz="8" w:space="0" w:color="auto"/>
               <w:left w:val="single" w:sz="4" w:space="0" w:color="auto"/>
@@ -4839,7 +4878,7 @@
         </w:tc>
         <w:tc>
           <w:tcPr>
-            <w:tcW w:w="7029" w:type="dxa"/>
+            <w:tcW w:w="7722" w:type="dxa"/>
             <w:tcBorders>
               <w:top w:val="single" w:sz="8" w:space="0" w:color="auto"/>
               <w:left w:val="nil"/>
@@ -4876,11 +4915,11 @@
       </w:tr>
       <w:tr>
         <w:trPr>
-          <w:trHeight w:val="367"/>
+          <w:trHeight w:val="390"/>
         </w:trPr>
         <w:tc>
           <w:tcPr>
-            <w:tcW w:w="1975" w:type="dxa"/>
+            <w:tcW w:w="2169" w:type="dxa"/>
             <w:tcBorders>
               <w:top w:val="single" w:sz="8" w:space="0" w:color="auto"/>
               <w:left w:val="single" w:sz="4" w:space="0" w:color="auto"/>
@@ -4916,7 +4955,7 @@
         </w:tc>
         <w:tc>
           <w:tcPr>
-            <w:tcW w:w="7029" w:type="dxa"/>
+            <w:tcW w:w="7722" w:type="dxa"/>
             <w:tcBorders>
               <w:top w:val="single" w:sz="8" w:space="0" w:color="auto"/>
               <w:left w:val="nil"/>
@@ -4946,6 +4985,15 @@
                 <w:szCs w:val="28"/>
                 <w:lang w:val="en-IN" w:eastAsia="en-IN"/>
               </w:rPr>
+              <w:t xml:space="preserve">Basic </w:t>
+            </w:r>
+            <w:r>
+              <w:rPr>
+                <w:color w:val="000000"/>
+                <w:sz w:val="28"/>
+                <w:szCs w:val="28"/>
+                <w:lang w:val="en-IN" w:eastAsia="en-IN"/>
+              </w:rPr>
               <w:t xml:space="preserve">UI design using </w:t>
             </w:r>
             <w:proofErr w:type="spellStart"/>
@@ -4964,11 +5012,11 @@
       </w:tr>
       <w:tr>
         <w:trPr>
-          <w:trHeight w:val="367"/>
+          <w:trHeight w:val="390"/>
         </w:trPr>
         <w:tc>
           <w:tcPr>
-            <w:tcW w:w="1975" w:type="dxa"/>
+            <w:tcW w:w="2169" w:type="dxa"/>
             <w:tcBorders>
               <w:top w:val="single" w:sz="8" w:space="0" w:color="auto"/>
               <w:left w:val="single" w:sz="4" w:space="0" w:color="auto"/>
@@ -5004,7 +5052,7 @@
         </w:tc>
         <w:tc>
           <w:tcPr>
-            <w:tcW w:w="7029" w:type="dxa"/>
+            <w:tcW w:w="7722" w:type="dxa"/>
             <w:tcBorders>
               <w:top w:val="single" w:sz="8" w:space="0" w:color="auto"/>
               <w:left w:val="nil"/>
@@ -5041,11 +5089,11 @@
       </w:tr>
       <w:tr>
         <w:trPr>
-          <w:trHeight w:val="367"/>
+          <w:trHeight w:val="390"/>
         </w:trPr>
         <w:tc>
           <w:tcPr>
-            <w:tcW w:w="1975" w:type="dxa"/>
+            <w:tcW w:w="2169" w:type="dxa"/>
             <w:tcBorders>
               <w:top w:val="single" w:sz="8" w:space="0" w:color="auto"/>
               <w:left w:val="single" w:sz="4" w:space="0" w:color="auto"/>
@@ -5081,7 +5129,7 @@
         </w:tc>
         <w:tc>
           <w:tcPr>
-            <w:tcW w:w="7029" w:type="dxa"/>
+            <w:tcW w:w="7722" w:type="dxa"/>
             <w:tcBorders>
               <w:top w:val="single" w:sz="8" w:space="0" w:color="auto"/>
               <w:left w:val="nil"/>
@@ -5118,11 +5166,11 @@
       </w:tr>
       <w:tr>
         <w:trPr>
-          <w:trHeight w:val="367"/>
+          <w:trHeight w:val="390"/>
         </w:trPr>
         <w:tc>
           <w:tcPr>
-            <w:tcW w:w="1975" w:type="dxa"/>
+            <w:tcW w:w="2169" w:type="dxa"/>
             <w:tcBorders>
               <w:top w:val="single" w:sz="8" w:space="0" w:color="auto"/>
               <w:left w:val="single" w:sz="4" w:space="0" w:color="auto"/>
@@ -5158,7 +5206,7 @@
         </w:tc>
         <w:tc>
           <w:tcPr>
-            <w:tcW w:w="7029" w:type="dxa"/>
+            <w:tcW w:w="7722" w:type="dxa"/>
             <w:tcBorders>
               <w:top w:val="single" w:sz="8" w:space="0" w:color="auto"/>
               <w:left w:val="nil"/>
@@ -5195,11 +5243,11 @@
       </w:tr>
       <w:tr>
         <w:trPr>
-          <w:trHeight w:val="367"/>
+          <w:trHeight w:val="390"/>
         </w:trPr>
         <w:tc>
           <w:tcPr>
-            <w:tcW w:w="1975" w:type="dxa"/>
+            <w:tcW w:w="2169" w:type="dxa"/>
             <w:tcBorders>
               <w:top w:val="single" w:sz="8" w:space="0" w:color="auto"/>
               <w:left w:val="single" w:sz="4" w:space="0" w:color="auto"/>
@@ -5235,7 +5283,7 @@
         </w:tc>
         <w:tc>
           <w:tcPr>
-            <w:tcW w:w="7029" w:type="dxa"/>
+            <w:tcW w:w="7722" w:type="dxa"/>
             <w:tcBorders>
               <w:top w:val="single" w:sz="8" w:space="0" w:color="auto"/>
               <w:left w:val="nil"/>
@@ -5272,11 +5320,11 @@
       </w:tr>
       <w:tr>
         <w:trPr>
-          <w:trHeight w:val="367"/>
+          <w:trHeight w:val="390"/>
         </w:trPr>
         <w:tc>
           <w:tcPr>
-            <w:tcW w:w="1975" w:type="dxa"/>
+            <w:tcW w:w="2169" w:type="dxa"/>
             <w:tcBorders>
               <w:top w:val="single" w:sz="8" w:space="0" w:color="auto"/>
               <w:left w:val="single" w:sz="4" w:space="0" w:color="auto"/>
@@ -5312,7 +5360,7 @@
         </w:tc>
         <w:tc>
           <w:tcPr>
-            <w:tcW w:w="7029" w:type="dxa"/>
+            <w:tcW w:w="7722" w:type="dxa"/>
             <w:tcBorders>
               <w:top w:val="single" w:sz="8" w:space="0" w:color="auto"/>
               <w:left w:val="nil"/>
@@ -5349,11 +5397,11 @@
       </w:tr>
       <w:tr>
         <w:trPr>
-          <w:trHeight w:val="367"/>
+          <w:trHeight w:val="390"/>
         </w:trPr>
         <w:tc>
           <w:tcPr>
-            <w:tcW w:w="1975" w:type="dxa"/>
+            <w:tcW w:w="2169" w:type="dxa"/>
             <w:tcBorders>
               <w:top w:val="single" w:sz="8" w:space="0" w:color="auto"/>
               <w:left w:val="single" w:sz="4" w:space="0" w:color="auto"/>
@@ -5389,7 +5437,7 @@
         </w:tc>
         <w:tc>
           <w:tcPr>
-            <w:tcW w:w="7029" w:type="dxa"/>
+            <w:tcW w:w="7722" w:type="dxa"/>
             <w:tcBorders>
               <w:top w:val="single" w:sz="8" w:space="0" w:color="auto"/>
               <w:left w:val="nil"/>
@@ -5426,11 +5474,11 @@
       </w:tr>
       <w:tr>
         <w:trPr>
-          <w:trHeight w:val="367"/>
+          <w:trHeight w:val="390"/>
         </w:trPr>
         <w:tc>
           <w:tcPr>
-            <w:tcW w:w="1975" w:type="dxa"/>
+            <w:tcW w:w="2169" w:type="dxa"/>
             <w:tcBorders>
               <w:top w:val="single" w:sz="8" w:space="0" w:color="auto"/>
               <w:left w:val="single" w:sz="4" w:space="0" w:color="auto"/>
@@ -5465,7 +5513,7 @@
         </w:tc>
         <w:tc>
           <w:tcPr>
-            <w:tcW w:w="7029" w:type="dxa"/>
+            <w:tcW w:w="7722" w:type="dxa"/>
             <w:tcBorders>
               <w:top w:val="single" w:sz="8" w:space="0" w:color="auto"/>
               <w:left w:val="nil"/>
@@ -5501,11 +5549,11 @@
       </w:tr>
       <w:tr>
         <w:trPr>
-          <w:trHeight w:val="367"/>
+          <w:trHeight w:val="390"/>
         </w:trPr>
         <w:tc>
           <w:tcPr>
-            <w:tcW w:w="1975" w:type="dxa"/>
+            <w:tcW w:w="2169" w:type="dxa"/>
             <w:tcBorders>
               <w:top w:val="single" w:sz="8" w:space="0" w:color="auto"/>
               <w:left w:val="single" w:sz="4" w:space="0" w:color="auto"/>
@@ -5540,7 +5588,7 @@
         </w:tc>
         <w:tc>
           <w:tcPr>
-            <w:tcW w:w="7029" w:type="dxa"/>
+            <w:tcW w:w="7722" w:type="dxa"/>
             <w:tcBorders>
               <w:top w:val="single" w:sz="8" w:space="0" w:color="auto"/>
               <w:left w:val="nil"/>
@@ -5589,6 +5637,54 @@
     </w:sectPr>
   </w:body>
 </w:document>
+</file>
+
+<file path=word/endnotes.xml><?xml version="1.0" encoding="utf-8"?>
+<w:endnotes xmlns:wpc="http://schemas.microsoft.com/office/word/2010/wordprocessingCanvas" xmlns:cx="http://schemas.microsoft.com/office/drawing/2014/chartex" xmlns:cx1="http://schemas.microsoft.com/office/drawing/2015/9/8/chartex" xmlns:cx2="http://schemas.microsoft.com/office/drawing/2015/10/21/chartex" xmlns:cx3="http://schemas.microsoft.com/office/drawing/2016/5/9/chartex" xmlns:cx4="http://schemas.microsoft.com/office/drawing/2016/5/10/chartex" xmlns:cx5="http://schemas.microsoft.com/office/drawing/2016/5/11/chartex" xmlns:cx6="http://schemas.microsoft.com/office/drawing/2016/5/12/chartex" xmlns:cx7="http://schemas.microsoft.com/office/drawing/2016/5/13/chartex" xmlns:cx8="http://schemas.microsoft.com/office/drawing/2016/5/14/chartex" xmlns:mc="http://schemas.openxmlformats.org/markup-compatibility/2006" xmlns:aink="http://schemas.microsoft.com/office/drawing/2016/ink" xmlns:am3d="http://schemas.microsoft.com/office/drawing/2017/model3d" xmlns:o="urn:schemas-microsoft-com:office:office" xmlns:oel="http://schemas.microsoft.com/office/2019/extlst" xmlns:r="http://schemas.openxmlformats.org/officeDocument/2006/relationships" xmlns:m="http://schemas.openxmlformats.org/officeDocument/2006/math" xmlns:v="urn:schemas-microsoft-com:vml" xmlns:wp14="http://schemas.microsoft.com/office/word/2010/wordprocessingDrawing" xmlns:wp="http://schemas.openxmlformats.org/drawingml/2006/wordprocessingDrawing" xmlns:w10="urn:schemas-microsoft-com:office:word" xmlns:w="http://schemas.openxmlformats.org/wordprocessingml/2006/main" xmlns:w14="http://schemas.microsoft.com/office/word/2010/wordml" xmlns:w15="http://schemas.microsoft.com/office/word/2012/wordml" xmlns:w16cex="http://schemas.microsoft.com/office/word/2018/wordml/cex" xmlns:w16cid="http://schemas.microsoft.com/office/word/2016/wordml/cid" xmlns:w16="http://schemas.microsoft.com/office/word/2018/wordml" xmlns:w16du="http://schemas.microsoft.com/office/word/2023/wordml/word16du" xmlns:w16sdtdh="http://schemas.microsoft.com/office/word/2020/wordml/sdtdatahash" xmlns:w16sdtfl="http://schemas.microsoft.com/office/word/2024/wordml/sdtformatlock" xmlns:w16se="http://schemas.microsoft.com/office/word/2015/wordml/symex" xmlns:wpg="http://schemas.microsoft.com/office/word/2010/wordprocessingGroup" xmlns:wpi="http://schemas.microsoft.com/office/word/2010/wordprocessingInk" xmlns:wne="http://schemas.microsoft.com/office/word/2006/wordml" xmlns:wps="http://schemas.microsoft.com/office/word/2010/wordprocessingShape" mc:Ignorable="w14 w15 w16se w16cid w16 w16cex w16sdtdh w16sdtfl w16du wp14">
+  <w:endnote w:type="separator" w:id="-1">
+    <w:p>
+      <w:r>
+        <w:separator/>
+      </w:r>
+    </w:p>
+  </w:endnote>
+  <w:endnote w:type="continuationSeparator" w:id="0">
+    <w:p>
+      <w:r>
+        <w:continuationSeparator/>
+      </w:r>
+    </w:p>
+  </w:endnote>
+</w:endnotes>
+</file>
+
+<file path=word/footnotes.xml><?xml version="1.0" encoding="utf-8"?>
+<w:footnotes xmlns:wpc="http://schemas.microsoft.com/office/word/2010/wordprocessingCanvas" xmlns:cx="http://schemas.microsoft.com/office/drawing/2014/chartex" xmlns:cx1="http://schemas.microsoft.com/office/drawing/2015/9/8/chartex" xmlns:cx2="http://schemas.microsoft.com/office/drawing/2015/10/21/chartex" xmlns:cx3="http://schemas.microsoft.com/office/drawing/2016/5/9/chartex" xmlns:cx4="http://schemas.microsoft.com/office/drawing/2016/5/10/chartex" xmlns:cx5="http://schemas.microsoft.com/office/drawing/2016/5/11/chartex" xmlns:cx6="http://schemas.microsoft.com/office/drawing/2016/5/12/chartex" xmlns:cx7="http://schemas.microsoft.com/office/drawing/2016/5/13/chartex" xmlns:cx8="http://schemas.microsoft.com/office/drawing/2016/5/14/chartex" xmlns:mc="http://schemas.openxmlformats.org/markup-compatibility/2006" xmlns:aink="http://schemas.microsoft.com/office/drawing/2016/ink" xmlns:am3d="http://schemas.microsoft.com/office/drawing/2017/model3d" xmlns:o="urn:schemas-microsoft-com:office:office" xmlns:oel="http://schemas.microsoft.com/office/2019/extlst" xmlns:r="http://schemas.openxmlformats.org/officeDocument/2006/relationships" xmlns:m="http://schemas.openxmlformats.org/officeDocument/2006/math" xmlns:v="urn:schemas-microsoft-com:vml" xmlns:wp14="http://schemas.microsoft.com/office/word/2010/wordprocessingDrawing" xmlns:wp="http://schemas.openxmlformats.org/drawingml/2006/wordprocessingDrawing" xmlns:w10="urn:schemas-microsoft-com:office:word" xmlns:w="http://schemas.openxmlformats.org/wordprocessingml/2006/main" xmlns:w14="http://schemas.microsoft.com/office/word/2010/wordml" xmlns:w15="http://schemas.microsoft.com/office/word/2012/wordml" xmlns:w16cex="http://schemas.microsoft.com/office/word/2018/wordml/cex" xmlns:w16cid="http://schemas.microsoft.com/office/word/2016/wordml/cid" xmlns:w16="http://schemas.microsoft.com/office/word/2018/wordml" xmlns:w16du="http://schemas.microsoft.com/office/word/2023/wordml/word16du" xmlns:w16sdtdh="http://schemas.microsoft.com/office/word/2020/wordml/sdtdatahash" xmlns:w16sdtfl="http://schemas.microsoft.com/office/word/2024/wordml/sdtformatlock" xmlns:w16se="http://schemas.microsoft.com/office/word/2015/wordml/symex" xmlns:wpg="http://schemas.microsoft.com/office/word/2010/wordprocessingGroup" xmlns:wpi="http://schemas.microsoft.com/office/word/2010/wordprocessingInk" xmlns:wne="http://schemas.microsoft.com/office/word/2006/wordml" xmlns:wps="http://schemas.microsoft.com/office/word/2010/wordprocessingShape" mc:Ignorable="w14 w15 w16se w16cid w16 w16cex w16sdtdh w16sdtfl w16du wp14">
+  <w:footnote w:type="separator" w:id="-1">
+    <w:p>
+      <w:r>
+        <w:separator/>
+      </w:r>
+    </w:p>
+  </w:footnote>
+  <w:footnote w:type="continuationSeparator" w:id="0">
+    <w:p>
+      <w:r>
+        <w:continuationSeparator/>
+      </w:r>
+    </w:p>
+  </w:footnote>
+</w:footnotes>
+</file>
+
+<file path=word/header1.xml><?xml version="1.0" encoding="utf-8"?>
+<w:hdr xmlns:wpc="http://schemas.microsoft.com/office/word/2010/wordprocessingCanvas" xmlns:cx="http://schemas.microsoft.com/office/drawing/2014/chartex" xmlns:cx1="http://schemas.microsoft.com/office/drawing/2015/9/8/chartex" xmlns:cx2="http://schemas.microsoft.com/office/drawing/2015/10/21/chartex" xmlns:cx3="http://schemas.microsoft.com/office/drawing/2016/5/9/chartex" xmlns:cx4="http://schemas.microsoft.com/office/drawing/2016/5/10/chartex" xmlns:cx5="http://schemas.microsoft.com/office/drawing/2016/5/11/chartex" xmlns:cx6="http://schemas.microsoft.com/office/drawing/2016/5/12/chartex" xmlns:cx7="http://schemas.microsoft.com/office/drawing/2016/5/13/chartex" xmlns:cx8="http://schemas.microsoft.com/office/drawing/2016/5/14/chartex" xmlns:mc="http://schemas.openxmlformats.org/markup-compatibility/2006" xmlns:aink="http://schemas.microsoft.com/office/drawing/2016/ink" xmlns:am3d="http://schemas.microsoft.com/office/drawing/2017/model3d" xmlns:o="urn:schemas-microsoft-com:office:office" xmlns:oel="http://schemas.microsoft.com/office/2019/extlst" xmlns:r="http://schemas.openxmlformats.org/officeDocument/2006/relationships" xmlns:m="http://schemas.openxmlformats.org/officeDocument/2006/math" xmlns:v="urn:schemas-microsoft-com:vml" xmlns:wp14="http://schemas.microsoft.com/office/word/2010/wordprocessingDrawing" xmlns:wp="http://schemas.openxmlformats.org/drawingml/2006/wordprocessingDrawing" xmlns:w10="urn:schemas-microsoft-com:office:word" xmlns:w="http://schemas.openxmlformats.org/wordprocessingml/2006/main" xmlns:w14="http://schemas.microsoft.com/office/word/2010/wordml" xmlns:w15="http://schemas.microsoft.com/office/word/2012/wordml" xmlns:w16cex="http://schemas.microsoft.com/office/word/2018/wordml/cex" xmlns:w16cid="http://schemas.microsoft.com/office/word/2016/wordml/cid" xmlns:w16="http://schemas.microsoft.com/office/word/2018/wordml" xmlns:w16du="http://schemas.microsoft.com/office/word/2023/wordml/word16du" xmlns:w16sdtdh="http://schemas.microsoft.com/office/word/2020/wordml/sdtdatahash" xmlns:w16sdtfl="http://schemas.microsoft.com/office/word/2024/wordml/sdtformatlock" xmlns:w16se="http://schemas.microsoft.com/office/word/2015/wordml/symex" xmlns:wpg="http://schemas.microsoft.com/office/word/2010/wordprocessingGroup" xmlns:wpi="http://schemas.microsoft.com/office/word/2010/wordprocessingInk" xmlns:wne="http://schemas.microsoft.com/office/word/2006/wordml" xmlns:wps="http://schemas.microsoft.com/office/word/2010/wordprocessingShape" mc:Ignorable="w14 w15 w16se w16cid w16 w16cex w16sdtdh w16sdtfl w16du wp14">
+  <w:p>
+    <w:pPr>
+      <w:pStyle w:val="Header"/>
+    </w:pPr>
+  </w:p>
+</w:hdr>
 </file>
 
 <file path=word/numbering.xml><?xml version="1.0" encoding="utf-8"?>
@@ -10445,6 +10541,7 @@
   <w:style w:type="character" w:default="1" w:styleId="DefaultParagraphFont">
     <w:name w:val="Default Paragraph Font"/>
     <w:uiPriority w:val="1"/>
+    <w:semiHidden/>
     <w:unhideWhenUsed/>
   </w:style>
   <w:style w:type="table" w:default="1" w:styleId="TableNormal">
@@ -10553,6 +10650,54 @@
       <w:rFonts w:ascii="Times New Roman" w:eastAsia="Times New Roman" w:hAnsi="Times New Roman" w:cs="Times New Roman"/>
       <w:sz w:val="28"/>
       <w:szCs w:val="28"/>
+    </w:rPr>
+  </w:style>
+  <w:style w:type="paragraph" w:styleId="Header">
+    <w:name w:val="header"/>
+    <w:basedOn w:val="Normal"/>
+    <w:link w:val="HeaderChar"/>
+    <w:uiPriority w:val="99"/>
+    <w:unhideWhenUsed/>
+    <w:rsid w:val="009B2690"/>
+    <w:pPr>
+      <w:tabs>
+        <w:tab w:val="center" w:pos="4513"/>
+        <w:tab w:val="right" w:pos="9026"/>
+      </w:tabs>
+    </w:pPr>
+  </w:style>
+  <w:style w:type="character" w:customStyle="1" w:styleId="HeaderChar">
+    <w:name w:val="Header Char"/>
+    <w:basedOn w:val="DefaultParagraphFont"/>
+    <w:link w:val="Header"/>
+    <w:uiPriority w:val="99"/>
+    <w:rsid w:val="009B2690"/>
+    <w:rPr>
+      <w:rFonts w:ascii="Times New Roman" w:eastAsia="Times New Roman" w:hAnsi="Times New Roman" w:cs="Times New Roman"/>
+    </w:rPr>
+  </w:style>
+  <w:style w:type="paragraph" w:styleId="Footer">
+    <w:name w:val="footer"/>
+    <w:basedOn w:val="Normal"/>
+    <w:link w:val="FooterChar"/>
+    <w:uiPriority w:val="99"/>
+    <w:unhideWhenUsed/>
+    <w:rsid w:val="009B2690"/>
+    <w:pPr>
+      <w:tabs>
+        <w:tab w:val="center" w:pos="4513"/>
+        <w:tab w:val="right" w:pos="9026"/>
+      </w:tabs>
+    </w:pPr>
+  </w:style>
+  <w:style w:type="character" w:customStyle="1" w:styleId="FooterChar">
+    <w:name w:val="Footer Char"/>
+    <w:basedOn w:val="DefaultParagraphFont"/>
+    <w:link w:val="Footer"/>
+    <w:uiPriority w:val="99"/>
+    <w:rsid w:val="009B2690"/>
+    <w:rPr>
+      <w:rFonts w:ascii="Times New Roman" w:eastAsia="Times New Roman" w:hAnsi="Times New Roman" w:cs="Times New Roman"/>
     </w:rPr>
   </w:style>
 </w:styles>

</xml_diff>